<commit_message>
Update Assignment Cover Sheet FINAL S2 2026.docx
</commit_message>
<xml_diff>
--- a/Assignment Cover Sheet FINAL S2 2026.docx
+++ b/Assignment Cover Sheet FINAL S2 2026.docx
@@ -135,6 +135,9 @@
             <w:pPr>
               <w:spacing w:after="0" w:line="240" w:lineRule="auto"/>
             </w:pPr>
+            <w:r>
+              <w:t>40100</w:t>
+            </w:r>
           </w:p>
         </w:tc>
       </w:tr>
@@ -203,6 +206,9 @@
             <w:pPr>
               <w:spacing w:after="0" w:line="240" w:lineRule="auto"/>
             </w:pPr>
+            <w:r>
+              <w:t xml:space="preserve">Data Science Applications </w:t>
+            </w:r>
           </w:p>
         </w:tc>
       </w:tr>
@@ -271,6 +277,9 @@
             <w:pPr>
               <w:spacing w:after="0" w:line="240" w:lineRule="auto"/>
             </w:pPr>
+            <w:r>
+              <w:t>29/09/2026</w:t>
+            </w:r>
           </w:p>
         </w:tc>
       </w:tr>
@@ -401,7 +410,7 @@
               <w:spacing w:after="0" w:line="240" w:lineRule="auto"/>
             </w:pPr>
             <w:r>
-              <w:t>&lt;name of tool&gt;</w:t>
+              <w:t>Claude</w:t>
             </w:r>
           </w:p>
         </w:tc>
@@ -414,7 +423,7 @@
               <w:spacing w:after="0" w:line="240" w:lineRule="auto"/>
             </w:pPr>
             <w:r>
-              <w:t>&lt;brief description of purpose&gt;</w:t>
+              <w:t>Claude code was used throughout for code writing, debugging and commentary drafting.</w:t>
             </w:r>
           </w:p>
         </w:tc>
@@ -738,7 +747,13 @@
       </w:drawing>
     </w:r>
     <w:r>
-      <w:t>&lt;Subject Name&gt;</w:t>
+      <w:t>&lt;</w:t>
+    </w:r>
+    <w:r>
+      <w:t>Data Science Applications</w:t>
+    </w:r>
+    <w:r>
+      <w:t>&gt;</w:t>
     </w:r>
   </w:p>
   <w:p>
@@ -746,7 +761,13 @@
       <w:pStyle w:val="HeaderL2"/>
     </w:pPr>
     <w:r>
-      <w:t>&lt;Member ID&gt;</w:t>
+      <w:t>&lt;</w:t>
+    </w:r>
+    <w:r>
+      <w:t>40100</w:t>
+    </w:r>
+    <w:r>
+      <w:t>&gt;</w:t>
     </w:r>
   </w:p>
   <w:p>
@@ -4721,6 +4742,27 @@
 </file>
 
 <file path=customXml/item2.xml><?xml version="1.0" encoding="utf-8"?>
+<p:properties xmlns:p="http://schemas.microsoft.com/office/2006/metadata/properties" xmlns:xsi="http://www.w3.org/2001/XMLSchema-instance" xmlns:pc="http://schemas.microsoft.com/office/infopath/2007/PartnerControls">
+  <documentManagement>
+    <Processed xmlns="2ec87a04-a0b4-4835-a1cf-5721fffba7f7">false</Processed>
+    <lcf76f155ced4ddcb4097134ff3c332f xmlns="2ec87a04-a0b4-4835-a1cf-5721fffba7f7">
+      <Terms xmlns="http://schemas.microsoft.com/office/infopath/2007/PartnerControls"/>
+    </lcf76f155ced4ddcb4097134ff3c332f>
+    <TaxCatchAll xmlns="ab56e84a-2dbb-428f-b153-7df3e36aa938" xsi:nil="true"/>
+  </documentManagement>
+</p:properties>
+</file>
+
+<file path=customXml/item3.xml><?xml version="1.0" encoding="utf-8"?>
+<?mso-contentType ?>
+<FormTemplates xmlns="http://schemas.microsoft.com/sharepoint/v3/contenttype/forms">
+  <Display>DocumentLibraryForm</Display>
+  <Edit>DocumentLibraryForm</Edit>
+  <New>DocumentLibraryForm</New>
+</FormTemplates>
+</file>
+
+<file path=customXml/item4.xml><?xml version="1.0" encoding="utf-8"?>
 <ct:contentTypeSchema xmlns:ct="http://schemas.microsoft.com/office/2006/metadata/contentType" xmlns:ma="http://schemas.microsoft.com/office/2006/metadata/properties/metaAttributes" ct:_="" ma:_="" ma:contentTypeName="Document" ma:contentTypeID="0x01010003E392AF00D1E54A8B2A3B034FB47AB5" ma:contentTypeVersion="16" ma:contentTypeDescription="Create a new document." ma:contentTypeScope="" ma:versionID="4a394db74ec82e60825456e485497f82">
   <xsd:schema xmlns:xsd="http://www.w3.org/2001/XMLSchema" xmlns:xs="http://www.w3.org/2001/XMLSchema" xmlns:p="http://schemas.microsoft.com/office/2006/metadata/properties" xmlns:ns2="2ec87a04-a0b4-4835-a1cf-5721fffba7f7" xmlns:ns3="ab56e84a-2dbb-428f-b153-7df3e36aa938" targetNamespace="http://schemas.microsoft.com/office/2006/metadata/properties" ma:root="true" ma:fieldsID="6b7222c516715b67fdcad4b5c11aebdf" ns2:_="" ns3:_="">
     <xsd:import namespace="2ec87a04-a0b4-4835-a1cf-5721fffba7f7"/>
@@ -4961,27 +5003,6 @@
 </ct:contentTypeSchema>
 </file>
 
-<file path=customXml/item3.xml><?xml version="1.0" encoding="utf-8"?>
-<?mso-contentType ?>
-<FormTemplates xmlns="http://schemas.microsoft.com/sharepoint/v3/contenttype/forms">
-  <Display>DocumentLibraryForm</Display>
-  <Edit>DocumentLibraryForm</Edit>
-  <New>DocumentLibraryForm</New>
-</FormTemplates>
-</file>
-
-<file path=customXml/item4.xml><?xml version="1.0" encoding="utf-8"?>
-<p:properties xmlns:p="http://schemas.microsoft.com/office/2006/metadata/properties" xmlns:xsi="http://www.w3.org/2001/XMLSchema-instance" xmlns:pc="http://schemas.microsoft.com/office/infopath/2007/PartnerControls">
-  <documentManagement>
-    <Processed xmlns="2ec87a04-a0b4-4835-a1cf-5721fffba7f7">false</Processed>
-    <lcf76f155ced4ddcb4097134ff3c332f xmlns="2ec87a04-a0b4-4835-a1cf-5721fffba7f7">
-      <Terms xmlns="http://schemas.microsoft.com/office/infopath/2007/PartnerControls"/>
-    </lcf76f155ced4ddcb4097134ff3c332f>
-    <TaxCatchAll xmlns="ab56e84a-2dbb-428f-b153-7df3e36aa938" xsi:nil="true"/>
-  </documentManagement>
-</p:properties>
-</file>
-
 <file path=customXml/itemProps1.xml><?xml version="1.0" encoding="utf-8"?>
 <ds:datastoreItem xmlns:ds="http://schemas.openxmlformats.org/officeDocument/2006/customXml" ds:itemID="{EDDB6213-D6AE-4541-A668-73A3C66A601D}">
   <ds:schemaRefs>
@@ -4991,6 +5012,25 @@
 </file>
 
 <file path=customXml/itemProps2.xml><?xml version="1.0" encoding="utf-8"?>
+<ds:datastoreItem xmlns:ds="http://schemas.openxmlformats.org/officeDocument/2006/customXml" ds:itemID="{27F94770-81A6-445B-9261-FB027F083C4A}">
+  <ds:schemaRefs>
+    <ds:schemaRef ds:uri="http://schemas.microsoft.com/office/2006/metadata/properties"/>
+    <ds:schemaRef ds:uri="http://schemas.microsoft.com/office/infopath/2007/PartnerControls"/>
+    <ds:schemaRef ds:uri="2ec87a04-a0b4-4835-a1cf-5721fffba7f7"/>
+    <ds:schemaRef ds:uri="ab56e84a-2dbb-428f-b153-7df3e36aa938"/>
+  </ds:schemaRefs>
+</ds:datastoreItem>
+</file>
+
+<file path=customXml/itemProps3.xml><?xml version="1.0" encoding="utf-8"?>
+<ds:datastoreItem xmlns:ds="http://schemas.openxmlformats.org/officeDocument/2006/customXml" ds:itemID="{99A5B56C-43F2-4CAF-8F5D-E78E7601B576}">
+  <ds:schemaRefs>
+    <ds:schemaRef ds:uri="http://schemas.microsoft.com/sharepoint/v3/contenttype/forms"/>
+  </ds:schemaRefs>
+</ds:datastoreItem>
+</file>
+
+<file path=customXml/itemProps4.xml><?xml version="1.0" encoding="utf-8"?>
 <ds:datastoreItem xmlns:ds="http://schemas.openxmlformats.org/officeDocument/2006/customXml" ds:itemID="{2C9186E1-4CF4-49B2-8FA7-083C5BA60158}">
   <ds:schemaRefs>
     <ds:schemaRef ds:uri="http://schemas.microsoft.com/office/2006/metadata/contentType"/>
@@ -5007,23 +5047,4 @@
     <ds:schemaRef ds:uri="http://schemas.microsoft.com/internal/obd"/>
   </ds:schemaRefs>
 </ds:datastoreItem>
-</file>
-
-<file path=customXml/itemProps3.xml><?xml version="1.0" encoding="utf-8"?>
-<ds:datastoreItem xmlns:ds="http://schemas.openxmlformats.org/officeDocument/2006/customXml" ds:itemID="{99A5B56C-43F2-4CAF-8F5D-E78E7601B576}">
-  <ds:schemaRefs>
-    <ds:schemaRef ds:uri="http://schemas.microsoft.com/sharepoint/v3/contenttype/forms"/>
-  </ds:schemaRefs>
-</ds:datastoreItem>
-</file>
-
-<file path=customXml/itemProps4.xml><?xml version="1.0" encoding="utf-8"?>
-<ds:datastoreItem xmlns:ds="http://schemas.openxmlformats.org/officeDocument/2006/customXml" ds:itemID="{27F94770-81A6-445B-9261-FB027F083C4A}">
-  <ds:schemaRefs>
-    <ds:schemaRef ds:uri="http://schemas.microsoft.com/office/2006/metadata/properties"/>
-    <ds:schemaRef ds:uri="http://schemas.microsoft.com/office/infopath/2007/PartnerControls"/>
-    <ds:schemaRef ds:uri="2ec87a04-a0b4-4835-a1cf-5721fffba7f7"/>
-    <ds:schemaRef ds:uri="ab56e84a-2dbb-428f-b153-7df3e36aa938"/>
-  </ds:schemaRefs>
-</ds:datastoreItem>
 </file>
</xml_diff>